<commit_message>
Build 106; document titles show the version 0.1.1 without the build number
lazbuild does not raise the build number, so BuildNr is raised by hand before
each lazbuild run (CLAUDE.md, README).

Co-Authored-By: Claude Opus 5.5 <noreply@anthropic.com>
</commit_message>
<xml_diff>
--- a/docs/Specification_Current.docx
+++ b/docs/Specification_Current.docx
@@ -27,7 +27,7 @@
         <w:t xml:space="preserve"> </w:t>
       </w:r>
       <w:r>
-        <w:t xml:space="preserve">0.1.1.1 (baseline: build 42)</w:t>
+        <w:t xml:space="preserve">0.1.1</w:t>
       </w:r>
       <w:r>
         <w:t xml:space="preserve"> </w:t>
@@ -3538,9 +3538,9 @@
       <w:pPr>
         <w:pStyle w:val="Heading3"/>
       </w:pPr>
-      <w:bookmarkStart w:id="21" w:name="_b28b461a823b178fbd8e7d89ec6e24ec04efe9c"/>
-      <w:r>
-        <w:t xml:space="preserve">3.8 Verified copy and backup destination (build 38)</w:t>
+      <w:bookmarkStart w:id="21" w:name="_2f343208882cbdc0c45fc87f8dc52a42bffb8c9"/>
+      <w:r>
+        <w:t xml:space="preserve">3.8 Verified copy and backup destination</w:t>
       </w:r>
       <w:bookmarkEnd w:id="21"/>
     </w:p>

</xml_diff>

<commit_message>
Notes: plug-in features and the two fixes tested on Linux (GTK 2)
Co-Authored-By: Claude Opus 5.5 <noreply@anthropic.com>
</commit_message>
<xml_diff>
--- a/docs/Specification_Current.docx
+++ b/docs/Specification_Current.docx
@@ -3063,7 +3063,7 @@
               <w:pStyle w:val="Compact"/>
             </w:pPr>
             <w:r>
-              <w:t xml:space="preserve">Done (build 10) – tested on Windows: gray/black list, Remove and Install of a program plug-in, Install of a library and its token, Remove of a loaded library, Remove disabled for built-in plug-ins; not yet tested on Linux</w:t>
+              <w:t xml:space="preserve">Done (build 10) – tested on Windows: gray/black list, Remove and Install of a program plug-in, Install of a library and its token, Remove of a loaded library, Remove disabled for built-in plug-ins; tested on Linux (GTK 2) by the user</w:t>
             </w:r>
           </w:p>
         </w:tc>
@@ -3195,7 +3195,7 @@
               <w:pStyle w:val="Compact"/>
             </w:pPr>
             <w:r>
-              <w:t xml:space="preserve">Done – tested on Windows with a stand-in program and with the real converters (dnglab 0.8.0, Adobe DNG Converter 18.7: Nikon NEF and Canon CR2 to valid DNGs, raw kept, second run skipped) and inside a real download, including a failed step (both plug-ins, build 9); not yet tested on Linux</w:t>
+              <w:t xml:space="preserve">Done – tested on Windows with a stand-in program and with the real converters (dnglab 0.8.0, Adobe DNG Converter 18.7: Nikon NEF and Canon CR2 to valid DNGs, raw kept, second run skipped) and inside a real download, including a failed step (both plug-ins, build 9); tested on Linux (GTK 2) by the user</w:t>
             </w:r>
           </w:p>
         </w:tc>
@@ -3252,7 +3252,7 @@
               <w:pStyle w:val="Compact"/>
             </w:pPr>
             <w:r>
-              <w:t xml:space="preserve">Done (build 12) – unit test on Windows (camera JPEG with EXIF, JFIF-only and bare JPEG: values read back, image data byte for byte unchanged, second run skipped) and in the program on Windows (dpi and dots/cm); not yet tested on Linux</w:t>
+              <w:t xml:space="preserve">Done (build 12) – unit test on Windows (camera JPEG with EXIF, JFIF-only and bare JPEG: values read back, image data byte for byte unchanged, second run skipped) and in the program on Windows (dpi and dots/cm); tested on Linux (GTK 2) by the user</w:t>
             </w:r>
           </w:p>
         </w:tc>

</xml_diff>